<commit_message>
fix: nome do professor corrigido para Alex Ferreira em todas as referencias
- AGENTS.md: 'A confirmar no Moodle/AVA' → 'Prof. Alex Ferreira'
- README.md raiz: idem
- documentacao-geral-projeto-algoritmos.md: idem
- relatorio-academico-minhafila.md: 'Luis Paulo' → 'Alex Ferreira'
- relatorio-academico-minhafila.docx: corrigido programaticamente
- relatorio-academico-minhafila.pdf: regenerado do md
- ZIP recriado com todas as correcoes
</commit_message>
<xml_diff>
--- a/disciplinas/gcetens843-projeto-algoritmo-i/atividades/trabalhos/projeto-algoritmos/relatorio-academico-minhafila.docx
+++ b/disciplinas/gcetens843-projeto-algoritmo-i/atividades/trabalhos/projeto-algoritmos/relatorio-academico-minhafila.docx
@@ -166,13 +166,7 @@
         <w:jc w:val="center"/>
       </w:pPr>
       <w:r>
-        <w:rPr>
-          <w:rFonts w:ascii="Times New Roman" w:hAnsi="Times New Roman"/>
-          <w:b w:val="0"/>
-          <w:i w:val="0"/>
-          <w:sz w:val="24"/>
-        </w:rPr>
-        <w:t>Prof. Luis Paulo Morais Conceição</w:t>
+        <w:t>Prof. Alex Ferreira</w:t>
       </w:r>
     </w:p>
     <w:p>

</xml_diff>